<commit_message>
Dodana skica baze podataka
</commit_message>
<xml_diff>
--- a/Dokumentacija/radna_dokumentacija.docx
+++ b/Dokumentacija/radna_dokumentacija.docx
@@ -59,148 +59,202 @@
         <w:pStyle w:val="Default"/>
         <w:rPr>
           <w:rFonts w:asciiTheme="minorHAnsi" w:hAnsiTheme="minorHAnsi"/>
-        </w:rPr>
-      </w:pPr>
-      <w:r>
-        <w:rPr>
-          <w:rFonts w:asciiTheme="minorHAnsi" w:hAnsiTheme="minorHAnsi"/>
-        </w:rPr>
-        <w:t xml:space="preserve">Iz plana rada: </w:t>
-      </w:r>
-    </w:p>
-    <w:p>
-      <w:pPr>
-        <w:pStyle w:val="Default"/>
-        <w:rPr>
-          <w:rFonts w:asciiTheme="minorHAnsi" w:hAnsiTheme="minorHAnsi"/>
-          <w:sz w:val="22"/>
-          <w:szCs w:val="22"/>
-        </w:rPr>
-      </w:pPr>
-      <w:r>
-        <w:rPr>
-          <w:rFonts w:asciiTheme="minorHAnsi" w:hAnsiTheme="minorHAnsi"/>
-        </w:rPr>
-        <w:t xml:space="preserve"> </w:t>
-      </w:r>
-      <w:r>
-        <w:rPr>
-          <w:rFonts w:asciiTheme="minorHAnsi" w:hAnsiTheme="minorHAnsi"/>
-          <w:sz w:val="22"/>
-          <w:szCs w:val="22"/>
-        </w:rPr>
-        <w:t xml:space="preserve">09.03. – 15.03 : </w:t>
-      </w:r>
-    </w:p>
-    <w:p>
-      <w:pPr>
-        <w:pStyle w:val="Default"/>
-        <w:rPr>
-          <w:rFonts w:asciiTheme="minorHAnsi" w:hAnsiTheme="minorHAnsi"/>
-          <w:sz w:val="22"/>
-          <w:szCs w:val="22"/>
-        </w:rPr>
-      </w:pPr>
-      <w:r>
-        <w:rPr>
-          <w:rFonts w:asciiTheme="minorHAnsi" w:hAnsiTheme="minorHAnsi"/>
-          <w:sz w:val="22"/>
-          <w:szCs w:val="22"/>
-        </w:rPr>
-        <w:t xml:space="preserve">- </w:t>
-      </w:r>
-      <w:r>
-        <w:rPr>
-          <w:rFonts w:asciiTheme="minorHAnsi" w:hAnsiTheme="minorHAnsi"/>
           <w:b/>
           <w:bCs/>
-          <w:sz w:val="22"/>
-          <w:szCs w:val="22"/>
-        </w:rPr>
-        <w:t>Pregled aplikacije napravljene za Diplomski projekt i popravljanje mogućih pogrešaka</w:t>
-      </w:r>
-      <w:r>
-        <w:rPr>
-          <w:rFonts w:asciiTheme="minorHAnsi" w:hAnsiTheme="minorHAnsi"/>
-          <w:sz w:val="22"/>
-          <w:szCs w:val="22"/>
-        </w:rPr>
-        <w:t xml:space="preserve"> </w:t>
-      </w:r>
-    </w:p>
-    <w:p>
-      <w:pPr>
-        <w:pStyle w:val="Default"/>
-        <w:rPr>
-          <w:rFonts w:asciiTheme="minorHAnsi" w:hAnsiTheme="minorHAnsi"/>
-          <w:sz w:val="22"/>
-          <w:szCs w:val="22"/>
-        </w:rPr>
-      </w:pPr>
-      <w:r>
-        <w:rPr>
-          <w:rFonts w:asciiTheme="minorHAnsi" w:hAnsiTheme="minorHAnsi"/>
-          <w:sz w:val="22"/>
-          <w:szCs w:val="22"/>
-        </w:rPr>
-        <w:tab/>
-        <w:t>- napravljeno, sama aplikacija dodana na github</w:t>
-      </w:r>
-    </w:p>
-    <w:p>
-      <w:pPr>
-        <w:pStyle w:val="Default"/>
-        <w:rPr>
-          <w:rFonts w:asciiTheme="minorHAnsi" w:hAnsiTheme="minorHAnsi"/>
-          <w:sz w:val="22"/>
-          <w:szCs w:val="22"/>
-        </w:rPr>
-      </w:pPr>
-      <w:r>
-        <w:rPr>
-          <w:rFonts w:asciiTheme="minorHAnsi" w:hAnsiTheme="minorHAnsi"/>
-          <w:sz w:val="22"/>
-          <w:szCs w:val="22"/>
-        </w:rPr>
-        <w:tab/>
-        <w:t>- porazgovarati s mentorom o mogućnosti 2 odvojena github repozitorija radi jednostavnosti</w:t>
-      </w:r>
-      <w:r>
-        <w:rPr>
-          <w:rFonts w:asciiTheme="minorHAnsi" w:hAnsiTheme="minorHAnsi"/>
-          <w:sz w:val="22"/>
-          <w:szCs w:val="22"/>
-        </w:rPr>
-        <w:t xml:space="preserve"> – problemi s githubom i .git datotekom kad je u poddirektoriju</w:t>
-      </w:r>
-    </w:p>
-    <w:p>
-      <w:pPr>
-        <w:pStyle w:val="Default"/>
-        <w:rPr>
-          <w:rFonts w:asciiTheme="minorHAnsi" w:hAnsiTheme="minorHAnsi"/>
-          <w:sz w:val="22"/>
-          <w:szCs w:val="22"/>
-        </w:rPr>
-      </w:pPr>
-    </w:p>
-    <w:p>
-      <w:pPr>
-        <w:pStyle w:val="Default"/>
+          <w:sz w:val="28"/>
+          <w:szCs w:val="28"/>
+        </w:rPr>
+      </w:pPr>
+      <w:r>
         <w:rPr>
           <w:rFonts w:asciiTheme="minorHAnsi" w:hAnsiTheme="minorHAnsi"/>
           <w:b/>
           <w:bCs/>
-        </w:rPr>
-      </w:pPr>
+          <w:sz w:val="28"/>
+          <w:szCs w:val="28"/>
+        </w:rPr>
+        <w:t xml:space="preserve">Iz plana rada: </w:t>
+      </w:r>
+    </w:p>
+    <w:p>
+      <w:pPr>
+        <w:pStyle w:val="Default"/>
+        <w:rPr>
+          <w:rFonts w:asciiTheme="minorHAnsi" w:hAnsiTheme="minorHAnsi"/>
+          <w:sz w:val="22"/>
+          <w:szCs w:val="22"/>
+        </w:rPr>
+      </w:pPr>
+      <w:r>
+        <w:rPr>
+          <w:rFonts w:asciiTheme="minorHAnsi" w:hAnsiTheme="minorHAnsi"/>
+        </w:rPr>
+        <w:t xml:space="preserve"> </w:t>
+      </w:r>
+      <w:r>
+        <w:rPr>
+          <w:rFonts w:asciiTheme="minorHAnsi" w:hAnsiTheme="minorHAnsi"/>
+          <w:sz w:val="22"/>
+          <w:szCs w:val="22"/>
+        </w:rPr>
+        <w:t xml:space="preserve">09.03. – 15.03 : </w:t>
+      </w:r>
+    </w:p>
+    <w:p>
+      <w:pPr>
+        <w:pStyle w:val="Default"/>
+        <w:rPr>
+          <w:rFonts w:asciiTheme="minorHAnsi" w:hAnsiTheme="minorHAnsi"/>
+          <w:sz w:val="22"/>
+          <w:szCs w:val="22"/>
+        </w:rPr>
+      </w:pPr>
+      <w:r>
+        <w:rPr>
+          <w:rFonts w:asciiTheme="minorHAnsi" w:hAnsiTheme="minorHAnsi"/>
+          <w:sz w:val="22"/>
+          <w:szCs w:val="22"/>
+        </w:rPr>
+        <w:t xml:space="preserve">- </w:t>
+      </w:r>
       <w:r>
         <w:rPr>
           <w:rFonts w:asciiTheme="minorHAnsi" w:hAnsiTheme="minorHAnsi"/>
           <w:b/>
           <w:bCs/>
-        </w:rPr>
-        <w:t>- analiza zahtjeva i plan arhitekture</w:t>
-      </w:r>
+          <w:sz w:val="22"/>
+          <w:szCs w:val="22"/>
+        </w:rPr>
+        <w:t>Pregled aplikacije napravljene za Diplomski projekt i popravljanje mogućih pogrešaka</w:t>
+      </w:r>
+      <w:r>
+        <w:rPr>
+          <w:rFonts w:asciiTheme="minorHAnsi" w:hAnsiTheme="minorHAnsi"/>
+          <w:sz w:val="22"/>
+          <w:szCs w:val="22"/>
+        </w:rPr>
+        <w:t xml:space="preserve"> </w:t>
+      </w:r>
+    </w:p>
+    <w:p>
+      <w:pPr>
+        <w:pStyle w:val="Default"/>
+        <w:rPr>
+          <w:rFonts w:asciiTheme="minorHAnsi" w:hAnsiTheme="minorHAnsi"/>
+          <w:sz w:val="22"/>
+          <w:szCs w:val="22"/>
+        </w:rPr>
+      </w:pPr>
+      <w:r>
+        <w:rPr>
+          <w:rFonts w:asciiTheme="minorHAnsi" w:hAnsiTheme="minorHAnsi"/>
+          <w:sz w:val="22"/>
+          <w:szCs w:val="22"/>
+        </w:rPr>
+        <w:tab/>
+        <w:t xml:space="preserve">- napravljeno, sama aplikacija dodana na </w:t>
+      </w:r>
+      <w:proofErr w:type="spellStart"/>
+      <w:r>
+        <w:rPr>
+          <w:rFonts w:asciiTheme="minorHAnsi" w:hAnsiTheme="minorHAnsi"/>
+          <w:sz w:val="22"/>
+          <w:szCs w:val="22"/>
+        </w:rPr>
+        <w:t>github</w:t>
+      </w:r>
+      <w:proofErr w:type="spellEnd"/>
+    </w:p>
+    <w:p>
+      <w:pPr>
+        <w:pStyle w:val="Default"/>
+        <w:rPr>
+          <w:rFonts w:asciiTheme="minorHAnsi" w:hAnsiTheme="minorHAnsi"/>
+          <w:sz w:val="22"/>
+          <w:szCs w:val="22"/>
+        </w:rPr>
+      </w:pPr>
+      <w:r>
+        <w:rPr>
+          <w:rFonts w:asciiTheme="minorHAnsi" w:hAnsiTheme="minorHAnsi"/>
+          <w:sz w:val="22"/>
+          <w:szCs w:val="22"/>
+        </w:rPr>
+        <w:tab/>
+        <w:t xml:space="preserve">- porazgovarati s mentorom o mogućnosti 2 odvojena </w:t>
+      </w:r>
+      <w:proofErr w:type="spellStart"/>
+      <w:r>
+        <w:rPr>
+          <w:rFonts w:asciiTheme="minorHAnsi" w:hAnsiTheme="minorHAnsi"/>
+          <w:sz w:val="22"/>
+          <w:szCs w:val="22"/>
+        </w:rPr>
+        <w:t>github</w:t>
+      </w:r>
+      <w:proofErr w:type="spellEnd"/>
+      <w:r>
+        <w:rPr>
+          <w:rFonts w:asciiTheme="minorHAnsi" w:hAnsiTheme="minorHAnsi"/>
+          <w:sz w:val="22"/>
+          <w:szCs w:val="22"/>
+        </w:rPr>
+        <w:t xml:space="preserve"> repozitorija radi jednostavnosti</w:t>
+      </w:r>
+      <w:r>
+        <w:rPr>
+          <w:rFonts w:asciiTheme="minorHAnsi" w:hAnsiTheme="minorHAnsi"/>
+          <w:sz w:val="22"/>
+          <w:szCs w:val="22"/>
+        </w:rPr>
+        <w:t xml:space="preserve"> – problemi s </w:t>
+      </w:r>
+      <w:proofErr w:type="spellStart"/>
+      <w:r>
+        <w:rPr>
+          <w:rFonts w:asciiTheme="minorHAnsi" w:hAnsiTheme="minorHAnsi"/>
+          <w:sz w:val="22"/>
+          <w:szCs w:val="22"/>
+        </w:rPr>
+        <w:t>githubom</w:t>
+      </w:r>
+      <w:proofErr w:type="spellEnd"/>
+      <w:r>
+        <w:rPr>
+          <w:rFonts w:asciiTheme="minorHAnsi" w:hAnsiTheme="minorHAnsi"/>
+          <w:sz w:val="22"/>
+          <w:szCs w:val="22"/>
+        </w:rPr>
+        <w:t xml:space="preserve"> i .</w:t>
+      </w:r>
+      <w:proofErr w:type="spellStart"/>
+      <w:r>
+        <w:rPr>
+          <w:rFonts w:asciiTheme="minorHAnsi" w:hAnsiTheme="minorHAnsi"/>
+          <w:sz w:val="22"/>
+          <w:szCs w:val="22"/>
+        </w:rPr>
+        <w:t>git</w:t>
+      </w:r>
+      <w:proofErr w:type="spellEnd"/>
+      <w:r>
+        <w:rPr>
+          <w:rFonts w:asciiTheme="minorHAnsi" w:hAnsiTheme="minorHAnsi"/>
+          <w:sz w:val="22"/>
+          <w:szCs w:val="22"/>
+        </w:rPr>
+        <w:t xml:space="preserve"> datotekom kad je u poddirektoriju</w:t>
+      </w:r>
+    </w:p>
+    <w:p>
+      <w:pPr>
+        <w:pStyle w:val="Default"/>
+        <w:rPr>
+          <w:rFonts w:asciiTheme="minorHAnsi" w:hAnsiTheme="minorHAnsi"/>
+          <w:sz w:val="22"/>
+          <w:szCs w:val="22"/>
+        </w:rPr>
+      </w:pPr>
     </w:p>
     <w:p>
       <w:pPr>
@@ -209,31 +263,49 @@
           <w:rFonts w:asciiTheme="minorHAnsi" w:hAnsiTheme="minorHAnsi"/>
           <w:b/>
           <w:bCs/>
-          <w:sz w:val="22"/>
-          <w:szCs w:val="22"/>
-        </w:rPr>
-      </w:pPr>
-      <w:r>
-        <w:rPr>
-          <w:rFonts w:asciiTheme="minorHAnsi" w:hAnsiTheme="minorHAnsi"/>
-          <w:sz w:val="22"/>
-          <w:szCs w:val="22"/>
-        </w:rPr>
-        <w:tab/>
-      </w:r>
+        </w:rPr>
+      </w:pPr>
       <w:r>
         <w:rPr>
           <w:rFonts w:asciiTheme="minorHAnsi" w:hAnsiTheme="minorHAnsi"/>
           <w:b/>
           <w:bCs/>
         </w:rPr>
-        <w:t>-</w:t>
-      </w:r>
-      <w:r>
+        <w:t>- analiza zahtjeva i plan arhitekture</w:t>
+      </w:r>
+    </w:p>
+    <w:p>
+      <w:pPr>
+        <w:pStyle w:val="Default"/>
         <w:rPr>
           <w:rFonts w:asciiTheme="minorHAnsi" w:hAnsiTheme="minorHAnsi"/>
           <w:b/>
           <w:bCs/>
+          <w:sz w:val="22"/>
+          <w:szCs w:val="22"/>
+        </w:rPr>
+      </w:pPr>
+      <w:r>
+        <w:rPr>
+          <w:rFonts w:asciiTheme="minorHAnsi" w:hAnsiTheme="minorHAnsi"/>
+          <w:sz w:val="22"/>
+          <w:szCs w:val="22"/>
+        </w:rPr>
+        <w:tab/>
+      </w:r>
+      <w:r>
+        <w:rPr>
+          <w:rFonts w:asciiTheme="minorHAnsi" w:hAnsiTheme="minorHAnsi"/>
+          <w:b/>
+          <w:bCs/>
+        </w:rPr>
+        <w:t>-</w:t>
+      </w:r>
+      <w:r>
+        <w:rPr>
+          <w:rFonts w:asciiTheme="minorHAnsi" w:hAnsiTheme="minorHAnsi"/>
+          <w:b/>
+          <w:bCs/>
         </w:rPr>
         <w:t xml:space="preserve"> Funkcionalni zahtjevi:</w:t>
       </w:r>
@@ -728,8 +800,36 @@
           <w:szCs w:val="22"/>
         </w:rPr>
         <w:tab/>
-        <w:t>- aplikacija treba biti implementirana u programskom jeziku Dart koristeći Flutter</w:t>
-      </w:r>
+        <w:t xml:space="preserve">- aplikacija treba biti implementirana u programskom jeziku </w:t>
+      </w:r>
+      <w:proofErr w:type="spellStart"/>
+      <w:r>
+        <w:rPr>
+          <w:rFonts w:asciiTheme="minorHAnsi" w:hAnsiTheme="minorHAnsi"/>
+          <w:sz w:val="22"/>
+          <w:szCs w:val="22"/>
+        </w:rPr>
+        <w:t>Dart</w:t>
+      </w:r>
+      <w:proofErr w:type="spellEnd"/>
+      <w:r>
+        <w:rPr>
+          <w:rFonts w:asciiTheme="minorHAnsi" w:hAnsiTheme="minorHAnsi"/>
+          <w:sz w:val="22"/>
+          <w:szCs w:val="22"/>
+        </w:rPr>
+        <w:t xml:space="preserve"> koristeći </w:t>
+      </w:r>
+      <w:proofErr w:type="spellStart"/>
+      <w:r>
+        <w:rPr>
+          <w:rFonts w:asciiTheme="minorHAnsi" w:hAnsiTheme="minorHAnsi"/>
+          <w:sz w:val="22"/>
+          <w:szCs w:val="22"/>
+        </w:rPr>
+        <w:t>Flutter</w:t>
+      </w:r>
+      <w:proofErr w:type="spellEnd"/>
     </w:p>
     <w:p>
       <w:pPr>
@@ -1036,7 +1136,25 @@
           <w:sz w:val="22"/>
           <w:szCs w:val="22"/>
         </w:rPr>
-        <w:t>3. Sloj podataka: sloj za pohranu i dohvat podataka iz baze, tablice i modeli podataka, pohrana tablica namirnicam recepata, planova obroka i slično</w:t>
+        <w:t xml:space="preserve">3. Sloj podataka: sloj za pohranu i dohvat podataka iz baze, tablice i modeli podataka, pohrana tablica </w:t>
+      </w:r>
+      <w:proofErr w:type="spellStart"/>
+      <w:r>
+        <w:rPr>
+          <w:rFonts w:asciiTheme="minorHAnsi" w:hAnsiTheme="minorHAnsi"/>
+          <w:sz w:val="22"/>
+          <w:szCs w:val="22"/>
+        </w:rPr>
+        <w:t>namirnicam</w:t>
+      </w:r>
+      <w:proofErr w:type="spellEnd"/>
+      <w:r>
+        <w:rPr>
+          <w:rFonts w:asciiTheme="minorHAnsi" w:hAnsiTheme="minorHAnsi"/>
+          <w:sz w:val="22"/>
+          <w:szCs w:val="22"/>
+        </w:rPr>
+        <w:t xml:space="preserve"> recepata, planova obroka i slično</w:t>
       </w:r>
     </w:p>
     <w:p>
@@ -1096,7 +1214,25 @@
           <w:sz w:val="22"/>
           <w:szCs w:val="22"/>
         </w:rPr>
-        <w:t>Okruženje u kojem se piše kod je AndroidStudio, a za bazu još nisam odredio</w:t>
+        <w:t xml:space="preserve">Okruženje u kojem se piše kod je </w:t>
+      </w:r>
+      <w:proofErr w:type="spellStart"/>
+      <w:r>
+        <w:rPr>
+          <w:rFonts w:asciiTheme="minorHAnsi" w:hAnsiTheme="minorHAnsi"/>
+          <w:sz w:val="22"/>
+          <w:szCs w:val="22"/>
+        </w:rPr>
+        <w:t>AndroidStudio</w:t>
+      </w:r>
+      <w:proofErr w:type="spellEnd"/>
+      <w:r>
+        <w:rPr>
+          <w:rFonts w:asciiTheme="minorHAnsi" w:hAnsiTheme="minorHAnsi"/>
+          <w:sz w:val="22"/>
+          <w:szCs w:val="22"/>
+        </w:rPr>
+        <w:t>, a za bazu još nisam odredio</w:t>
       </w:r>
     </w:p>
     <w:p>
@@ -1175,6 +1311,224 @@
       <w:r>
         <w:t>će služiti za ML planiranje obroka</w:t>
       </w:r>
+    </w:p>
+    <w:p>
+      <w:pPr>
+        <w:spacing w:after="0"/>
+      </w:pPr>
+    </w:p>
+    <w:p>
+      <w:pPr>
+        <w:rPr>
+          <w:b/>
+          <w:bCs/>
+          <w:sz w:val="24"/>
+          <w:szCs w:val="24"/>
+        </w:rPr>
+      </w:pPr>
+      <w:r>
+        <w:rPr>
+          <w:b/>
+          <w:bCs/>
+          <w:sz w:val="24"/>
+          <w:szCs w:val="24"/>
+        </w:rPr>
+        <w:t>16.03. – 22. 03. :</w:t>
+      </w:r>
+    </w:p>
+    <w:p>
+      <w:pPr>
+        <w:spacing w:after="0"/>
+      </w:pPr>
+      <w:r>
+        <w:t>- izrada UML dijagrama, dizajn baze podataka</w:t>
+      </w:r>
+    </w:p>
+    <w:p>
+      <w:pPr>
+        <w:spacing w:after="0"/>
+      </w:pPr>
+    </w:p>
+    <w:p>
+      <w:pPr>
+        <w:spacing w:after="0"/>
+        <w:rPr>
+          <w:b/>
+          <w:bCs/>
+          <w:sz w:val="24"/>
+          <w:szCs w:val="24"/>
+        </w:rPr>
+      </w:pPr>
+      <w:r>
+        <w:rPr>
+          <w:b/>
+          <w:bCs/>
+          <w:sz w:val="24"/>
+          <w:szCs w:val="24"/>
+        </w:rPr>
+        <w:t>Izrada UML dijagrama:</w:t>
+      </w:r>
+    </w:p>
+    <w:p>
+      <w:pPr>
+        <w:spacing w:after="0"/>
+      </w:pPr>
+    </w:p>
+    <w:p>
+      <w:pPr>
+        <w:spacing w:after="0"/>
+        <w:rPr>
+          <w:b/>
+          <w:bCs/>
+          <w:sz w:val="24"/>
+          <w:szCs w:val="24"/>
+        </w:rPr>
+      </w:pPr>
+      <w:r>
+        <w:rPr>
+          <w:b/>
+          <w:bCs/>
+          <w:sz w:val="24"/>
+          <w:szCs w:val="24"/>
+        </w:rPr>
+        <w:t xml:space="preserve">Dizajn baze podataka: </w:t>
+      </w:r>
+    </w:p>
+    <w:p>
+      <w:pPr>
+        <w:spacing w:after="0"/>
+      </w:pPr>
+      <w:r>
+        <w:t xml:space="preserve">Baza podataka s prethodnog projekta koji nadograđujemo izgleda ovako: </w:t>
+      </w:r>
+    </w:p>
+    <w:p>
+      <w:pPr>
+        <w:spacing w:after="0"/>
+      </w:pPr>
+      <w:r>
+        <w:rPr>
+          <w:noProof/>
+        </w:rPr>
+        <w:drawing>
+          <wp:inline distT="0" distB="0" distL="0" distR="0" wp14:anchorId="2559BA0A" wp14:editId="5229657D">
+            <wp:extent cx="5760720" cy="2214880"/>
+            <wp:effectExtent l="0" t="0" r="0" b="0"/>
+            <wp:docPr id="79220234" name="Slika 1"/>
+            <wp:cNvGraphicFramePr>
+              <a:graphicFrameLocks xmlns:a="http://schemas.openxmlformats.org/drawingml/2006/main" noChangeAspect="1"/>
+            </wp:cNvGraphicFramePr>
+            <a:graphic xmlns:a="http://schemas.openxmlformats.org/drawingml/2006/main">
+              <a:graphicData uri="http://schemas.openxmlformats.org/drawingml/2006/picture">
+                <pic:pic xmlns:pic="http://schemas.openxmlformats.org/drawingml/2006/picture">
+                  <pic:nvPicPr>
+                    <pic:cNvPr id="0" name="Picture 1"/>
+                    <pic:cNvPicPr>
+                      <a:picLocks noChangeAspect="1" noChangeArrowheads="1"/>
+                    </pic:cNvPicPr>
+                  </pic:nvPicPr>
+                  <pic:blipFill>
+                    <a:blip r:embed="rId4">
+                      <a:extLst>
+                        <a:ext uri="{28A0092B-C50C-407E-A947-70E740481C1C}">
+                          <a14:useLocalDpi xmlns:a14="http://schemas.microsoft.com/office/drawing/2010/main" val="0"/>
+                        </a:ext>
+                      </a:extLst>
+                    </a:blip>
+                    <a:srcRect/>
+                    <a:stretch>
+                      <a:fillRect/>
+                    </a:stretch>
+                  </pic:blipFill>
+                  <pic:spPr bwMode="auto">
+                    <a:xfrm>
+                      <a:off x="0" y="0"/>
+                      <a:ext cx="5760720" cy="2214880"/>
+                    </a:xfrm>
+                    <a:prstGeom prst="rect">
+                      <a:avLst/>
+                    </a:prstGeom>
+                    <a:noFill/>
+                    <a:ln>
+                      <a:noFill/>
+                    </a:ln>
+                  </pic:spPr>
+                </pic:pic>
+              </a:graphicData>
+            </a:graphic>
+          </wp:inline>
+        </w:drawing>
+      </w:r>
+    </w:p>
+    <w:p>
+      <w:pPr>
+        <w:spacing w:after="0"/>
+      </w:pPr>
+      <w:r>
+        <w:lastRenderedPageBreak/>
+        <w:t xml:space="preserve">Potrebno ju je izmijeniti. Trenutno nisam siguran za veze između tablice, no ovo su tablice koje planiram imati: </w:t>
+      </w:r>
+    </w:p>
+    <w:p>
+      <w:pPr>
+        <w:spacing w:after="0"/>
+      </w:pPr>
+    </w:p>
+    <w:p>
+      <w:pPr>
+        <w:spacing w:after="0"/>
+      </w:pPr>
+      <w:r>
+        <w:rPr>
+          <w:noProof/>
+        </w:rPr>
+        <w:drawing>
+          <wp:inline distT="0" distB="0" distL="0" distR="0" wp14:anchorId="7CE0124A" wp14:editId="310FF1C7">
+            <wp:extent cx="5760720" cy="2003425"/>
+            <wp:effectExtent l="0" t="0" r="0" b="0"/>
+            <wp:docPr id="1625482763" name="Slika 2" descr="Slika na kojoj se prikazuje tekst, Font, dijagram, broj&#10;&#10;Opis je automatski generiran"/>
+            <wp:cNvGraphicFramePr>
+              <a:graphicFrameLocks xmlns:a="http://schemas.openxmlformats.org/drawingml/2006/main" noChangeAspect="1"/>
+            </wp:cNvGraphicFramePr>
+            <a:graphic xmlns:a="http://schemas.openxmlformats.org/drawingml/2006/main">
+              <a:graphicData uri="http://schemas.openxmlformats.org/drawingml/2006/picture">
+                <pic:pic xmlns:pic="http://schemas.openxmlformats.org/drawingml/2006/picture">
+                  <pic:nvPicPr>
+                    <pic:cNvPr id="1625482763" name="Slika 2" descr="Slika na kojoj se prikazuje tekst, Font, dijagram, broj&#10;&#10;Opis je automatski generiran"/>
+                    <pic:cNvPicPr/>
+                  </pic:nvPicPr>
+                  <pic:blipFill>
+                    <a:blip r:embed="rId5">
+                      <a:extLst>
+                        <a:ext uri="{28A0092B-C50C-407E-A947-70E740481C1C}">
+                          <a14:useLocalDpi xmlns:a14="http://schemas.microsoft.com/office/drawing/2010/main" val="0"/>
+                        </a:ext>
+                      </a:extLst>
+                    </a:blip>
+                    <a:stretch>
+                      <a:fillRect/>
+                    </a:stretch>
+                  </pic:blipFill>
+                  <pic:spPr>
+                    <a:xfrm>
+                      <a:off x="0" y="0"/>
+                      <a:ext cx="5760720" cy="2003425"/>
+                    </a:xfrm>
+                    <a:prstGeom prst="rect">
+                      <a:avLst/>
+                    </a:prstGeom>
+                  </pic:spPr>
+                </pic:pic>
+              </a:graphicData>
+            </a:graphic>
+          </wp:inline>
+        </w:drawing>
+      </w:r>
+    </w:p>
+    <w:p>
+      <w:pPr>
+        <w:spacing w:after="0"/>
+      </w:pPr>
     </w:p>
     <w:sectPr>
       <w:pgSz w:w="11906" w:h="16838"/>

</xml_diff>

<commit_message>
Dodani ispravljeni UML dijagrami
</commit_message>
<xml_diff>
--- a/Dokumentacija/radna_dokumentacija.docx
+++ b/Dokumentacija/radna_dokumentacija.docx
@@ -174,87 +174,6 @@
           <w:szCs w:val="22"/>
         </w:rPr>
       </w:pPr>
-      <w:r>
-        <w:rPr>
-          <w:rFonts w:asciiTheme="minorHAnsi" w:hAnsiTheme="minorHAnsi"/>
-          <w:sz w:val="22"/>
-          <w:szCs w:val="22"/>
-        </w:rPr>
-        <w:tab/>
-        <w:t xml:space="preserve">- porazgovarati s mentorom o mogućnosti 2 odvojena </w:t>
-      </w:r>
-      <w:proofErr w:type="spellStart"/>
-      <w:r>
-        <w:rPr>
-          <w:rFonts w:asciiTheme="minorHAnsi" w:hAnsiTheme="minorHAnsi"/>
-          <w:sz w:val="22"/>
-          <w:szCs w:val="22"/>
-        </w:rPr>
-        <w:t>github</w:t>
-      </w:r>
-      <w:proofErr w:type="spellEnd"/>
-      <w:r>
-        <w:rPr>
-          <w:rFonts w:asciiTheme="minorHAnsi" w:hAnsiTheme="minorHAnsi"/>
-          <w:sz w:val="22"/>
-          <w:szCs w:val="22"/>
-        </w:rPr>
-        <w:t xml:space="preserve"> repozitorija radi jednostavnosti</w:t>
-      </w:r>
-      <w:r>
-        <w:rPr>
-          <w:rFonts w:asciiTheme="minorHAnsi" w:hAnsiTheme="minorHAnsi"/>
-          <w:sz w:val="22"/>
-          <w:szCs w:val="22"/>
-        </w:rPr>
-        <w:t xml:space="preserve"> – problemi s </w:t>
-      </w:r>
-      <w:proofErr w:type="spellStart"/>
-      <w:r>
-        <w:rPr>
-          <w:rFonts w:asciiTheme="minorHAnsi" w:hAnsiTheme="minorHAnsi"/>
-          <w:sz w:val="22"/>
-          <w:szCs w:val="22"/>
-        </w:rPr>
-        <w:t>githubom</w:t>
-      </w:r>
-      <w:proofErr w:type="spellEnd"/>
-      <w:r>
-        <w:rPr>
-          <w:rFonts w:asciiTheme="minorHAnsi" w:hAnsiTheme="minorHAnsi"/>
-          <w:sz w:val="22"/>
-          <w:szCs w:val="22"/>
-        </w:rPr>
-        <w:t xml:space="preserve"> i .</w:t>
-      </w:r>
-      <w:proofErr w:type="spellStart"/>
-      <w:r>
-        <w:rPr>
-          <w:rFonts w:asciiTheme="minorHAnsi" w:hAnsiTheme="minorHAnsi"/>
-          <w:sz w:val="22"/>
-          <w:szCs w:val="22"/>
-        </w:rPr>
-        <w:t>git</w:t>
-      </w:r>
-      <w:proofErr w:type="spellEnd"/>
-      <w:r>
-        <w:rPr>
-          <w:rFonts w:asciiTheme="minorHAnsi" w:hAnsiTheme="minorHAnsi"/>
-          <w:sz w:val="22"/>
-          <w:szCs w:val="22"/>
-        </w:rPr>
-        <w:t xml:space="preserve"> datotekom kad je u poddirektoriju</w:t>
-      </w:r>
-    </w:p>
-    <w:p>
-      <w:pPr>
-        <w:pStyle w:val="Default"/>
-        <w:rPr>
-          <w:rFonts w:asciiTheme="minorHAnsi" w:hAnsiTheme="minorHAnsi"/>
-          <w:sz w:val="22"/>
-          <w:szCs w:val="22"/>
-        </w:rPr>
-      </w:pPr>
     </w:p>
     <w:p>
       <w:pPr>
@@ -656,17 +575,6 @@
     <w:p>
       <w:pPr>
         <w:pStyle w:val="Default"/>
-        <w:ind w:left="1416"/>
-        <w:rPr>
-          <w:rFonts w:asciiTheme="minorHAnsi" w:hAnsiTheme="minorHAnsi"/>
-          <w:sz w:val="22"/>
-          <w:szCs w:val="22"/>
-        </w:rPr>
-      </w:pPr>
-    </w:p>
-    <w:p>
-      <w:pPr>
-        <w:pStyle w:val="Default"/>
         <w:ind w:left="708"/>
         <w:rPr>
           <w:rFonts w:asciiTheme="minorHAnsi" w:hAnsiTheme="minorHAnsi"/>
@@ -703,83 +611,16 @@
         <w:ind w:left="708"/>
         <w:rPr>
           <w:rFonts w:asciiTheme="minorHAnsi" w:hAnsiTheme="minorHAnsi"/>
-          <w:sz w:val="22"/>
-          <w:szCs w:val="22"/>
-        </w:rPr>
-      </w:pPr>
-    </w:p>
-    <w:p>
-      <w:pPr>
-        <w:pStyle w:val="Default"/>
-        <w:ind w:left="708"/>
-        <w:rPr>
-          <w:rFonts w:asciiTheme="minorHAnsi" w:hAnsiTheme="minorHAnsi"/>
-          <w:sz w:val="22"/>
-          <w:szCs w:val="22"/>
-        </w:rPr>
-      </w:pPr>
-    </w:p>
-    <w:p>
-      <w:pPr>
-        <w:pStyle w:val="Default"/>
-        <w:ind w:left="708"/>
-        <w:rPr>
-          <w:rFonts w:asciiTheme="minorHAnsi" w:hAnsiTheme="minorHAnsi"/>
-          <w:sz w:val="22"/>
-          <w:szCs w:val="22"/>
-        </w:rPr>
-      </w:pPr>
-    </w:p>
-    <w:p>
-      <w:pPr>
-        <w:pStyle w:val="Default"/>
-        <w:ind w:left="708"/>
-        <w:rPr>
-          <w:rFonts w:asciiTheme="minorHAnsi" w:hAnsiTheme="minorHAnsi"/>
-          <w:sz w:val="22"/>
-          <w:szCs w:val="22"/>
-        </w:rPr>
-      </w:pPr>
-    </w:p>
-    <w:p>
-      <w:pPr>
-        <w:pStyle w:val="Default"/>
-        <w:ind w:left="708"/>
-        <w:rPr>
-          <w:rFonts w:asciiTheme="minorHAnsi" w:hAnsiTheme="minorHAnsi"/>
-          <w:sz w:val="22"/>
-          <w:szCs w:val="22"/>
-        </w:rPr>
-      </w:pPr>
-    </w:p>
-    <w:p>
-      <w:pPr>
-        <w:pStyle w:val="Default"/>
-        <w:ind w:left="708"/>
-        <w:rPr>
-          <w:rFonts w:asciiTheme="minorHAnsi" w:hAnsiTheme="minorHAnsi"/>
-          <w:sz w:val="22"/>
-          <w:szCs w:val="22"/>
-        </w:rPr>
-      </w:pPr>
-    </w:p>
-    <w:p>
-      <w:pPr>
-        <w:pStyle w:val="Default"/>
-        <w:ind w:left="708"/>
-        <w:rPr>
-          <w:rFonts w:asciiTheme="minorHAnsi" w:hAnsiTheme="minorHAnsi"/>
-          <w:b/>
-          <w:bCs/>
-        </w:rPr>
-      </w:pPr>
-      <w:r>
-        <w:rPr>
-          <w:rFonts w:asciiTheme="minorHAnsi" w:hAnsiTheme="minorHAnsi"/>
-          <w:b/>
-          <w:bCs/>
-        </w:rPr>
-        <w:lastRenderedPageBreak/>
+          <w:b/>
+          <w:bCs/>
+        </w:rPr>
+      </w:pPr>
+      <w:r>
+        <w:rPr>
+          <w:rFonts w:asciiTheme="minorHAnsi" w:hAnsiTheme="minorHAnsi"/>
+          <w:b/>
+          <w:bCs/>
+        </w:rPr>
         <w:t>- Nefunkcionalni zahtjevi:</w:t>
       </w:r>
     </w:p>
@@ -1273,24 +1114,6 @@
     </w:p>
     <w:p>
       <w:pPr>
-        <w:pStyle w:val="Default"/>
-        <w:rPr>
-          <w:rFonts w:asciiTheme="minorHAnsi" w:hAnsiTheme="minorHAnsi"/>
-          <w:sz w:val="22"/>
-          <w:szCs w:val="22"/>
-        </w:rPr>
-      </w:pPr>
-      <w:r>
-        <w:rPr>
-          <w:rFonts w:asciiTheme="minorHAnsi" w:hAnsiTheme="minorHAnsi"/>
-          <w:sz w:val="22"/>
-          <w:szCs w:val="22"/>
-        </w:rPr>
-        <w:t xml:space="preserve"> </w:t>
-      </w:r>
-    </w:p>
-    <w:p>
-      <w:pPr>
         <w:spacing w:after="0"/>
       </w:pPr>
       <w:r>
@@ -1314,11 +1137,6 @@
     </w:p>
     <w:p>
       <w:pPr>
-        <w:spacing w:after="0"/>
-      </w:pPr>
-    </w:p>
-    <w:p>
-      <w:pPr>
         <w:rPr>
           <w:b/>
           <w:bCs/>
@@ -1372,11 +1190,6 @@
     <w:p>
       <w:pPr>
         <w:spacing w:after="0"/>
-      </w:pPr>
-    </w:p>
-    <w:p>
-      <w:pPr>
-        <w:spacing w:after="0"/>
         <w:rPr>
           <w:b/>
           <w:bCs/>
@@ -1391,6 +1204,219 @@
           <w:sz w:val="24"/>
           <w:szCs w:val="24"/>
         </w:rPr>
+        <w:t xml:space="preserve">Use </w:t>
+      </w:r>
+      <w:proofErr w:type="spellStart"/>
+      <w:r>
+        <w:rPr>
+          <w:b/>
+          <w:bCs/>
+          <w:sz w:val="24"/>
+          <w:szCs w:val="24"/>
+        </w:rPr>
+        <w:t>Case</w:t>
+      </w:r>
+      <w:proofErr w:type="spellEnd"/>
+      <w:r>
+        <w:rPr>
+          <w:b/>
+          <w:bCs/>
+          <w:sz w:val="24"/>
+          <w:szCs w:val="24"/>
+        </w:rPr>
+        <w:t xml:space="preserve"> dijagram</w:t>
+      </w:r>
+    </w:p>
+    <w:p>
+      <w:pPr>
+        <w:spacing w:after="0"/>
+      </w:pPr>
+      <w:proofErr w:type="spellStart"/>
+      <w:r>
+        <w:t>UseCase</w:t>
+      </w:r>
+      <w:proofErr w:type="spellEnd"/>
+      <w:r>
+        <w:t xml:space="preserve"> dijagram opisuje osnovne slučajeve u kojima korisnik može sudjelovati. Detaljnije akcije poput </w:t>
+      </w:r>
+      <w:proofErr w:type="spellStart"/>
+      <w:r>
+        <w:t>dodavanja,brisanja,uređivanja</w:t>
+      </w:r>
+      <w:proofErr w:type="spellEnd"/>
+      <w:r>
+        <w:t xml:space="preserve"> i slično nisu na dijagramu radi jednostavnosti samog dijagrama, no opisani su u funkcionalnim zahtjevima.</w:t>
+      </w:r>
+    </w:p>
+    <w:p>
+      <w:pPr>
+        <w:spacing w:after="0"/>
+      </w:pPr>
+    </w:p>
+    <w:p>
+      <w:pPr>
+        <w:spacing w:after="0"/>
+        <w:jc w:val="center"/>
+      </w:pPr>
+      <w:r>
+        <w:rPr>
+          <w:noProof/>
+        </w:rPr>
+        <w:drawing>
+          <wp:inline distT="0" distB="0" distL="0" distR="0" wp14:anchorId="1A88CE59" wp14:editId="1CC461B9">
+            <wp:extent cx="5602297" cy="3611880"/>
+            <wp:effectExtent l="0" t="0" r="0" b="7620"/>
+            <wp:docPr id="529126581" name="Slika 1" descr="Slika na kojoj se prikazuje dijagram, tekst, crta, krug&#10;&#10;Opis je automatski generiran"/>
+            <wp:cNvGraphicFramePr>
+              <a:graphicFrameLocks xmlns:a="http://schemas.openxmlformats.org/drawingml/2006/main" noChangeAspect="1"/>
+            </wp:cNvGraphicFramePr>
+            <a:graphic xmlns:a="http://schemas.openxmlformats.org/drawingml/2006/main">
+              <a:graphicData uri="http://schemas.openxmlformats.org/drawingml/2006/picture">
+                <pic:pic xmlns:pic="http://schemas.openxmlformats.org/drawingml/2006/picture">
+                  <pic:nvPicPr>
+                    <pic:cNvPr id="529126581" name="Slika 1" descr="Slika na kojoj se prikazuje dijagram, tekst, crta, krug&#10;&#10;Opis je automatski generiran"/>
+                    <pic:cNvPicPr/>
+                  </pic:nvPicPr>
+                  <pic:blipFill>
+                    <a:blip r:embed="rId4">
+                      <a:extLst>
+                        <a:ext uri="{28A0092B-C50C-407E-A947-70E740481C1C}">
+                          <a14:useLocalDpi xmlns:a14="http://schemas.microsoft.com/office/drawing/2010/main" val="0"/>
+                        </a:ext>
+                      </a:extLst>
+                    </a:blip>
+                    <a:stretch>
+                      <a:fillRect/>
+                    </a:stretch>
+                  </pic:blipFill>
+                  <pic:spPr>
+                    <a:xfrm>
+                      <a:off x="0" y="0"/>
+                      <a:ext cx="5665035" cy="3652328"/>
+                    </a:xfrm>
+                    <a:prstGeom prst="rect">
+                      <a:avLst/>
+                    </a:prstGeom>
+                  </pic:spPr>
+                </pic:pic>
+              </a:graphicData>
+            </a:graphic>
+          </wp:inline>
+        </w:drawing>
+      </w:r>
+    </w:p>
+    <w:p>
+      <w:pPr>
+        <w:spacing w:after="0"/>
+        <w:rPr>
+          <w:b/>
+          <w:bCs/>
+          <w:sz w:val="24"/>
+          <w:szCs w:val="24"/>
+        </w:rPr>
+      </w:pPr>
+      <w:r>
+        <w:rPr>
+          <w:b/>
+          <w:bCs/>
+          <w:sz w:val="24"/>
+          <w:szCs w:val="24"/>
+        </w:rPr>
+        <w:lastRenderedPageBreak/>
+        <w:t>WBS dijagram</w:t>
+      </w:r>
+    </w:p>
+    <w:p>
+      <w:pPr>
+        <w:spacing w:after="0"/>
+      </w:pPr>
+      <w:r>
+        <w:t>Prikazuje razradu projekta na manje cjeline i zadatke. Podijelio sam ga na planiranje, analizu, oblikovanje sustava, razvoj aplikacije, testiranje i predaju. Svaka faza sadrži pripadajuće aktivnosti potrebne za realizaciju projekta.</w:t>
+      </w:r>
+    </w:p>
+    <w:p>
+      <w:pPr>
+        <w:spacing w:after="0"/>
+      </w:pPr>
+    </w:p>
+    <w:p>
+      <w:pPr>
+        <w:spacing w:after="0"/>
+      </w:pPr>
+      <w:r>
+        <w:rPr>
+          <w:noProof/>
+        </w:rPr>
+        <w:drawing>
+          <wp:inline distT="0" distB="0" distL="0" distR="0" wp14:anchorId="0AD0A544" wp14:editId="448BD644">
+            <wp:extent cx="5768340" cy="3010090"/>
+            <wp:effectExtent l="0" t="0" r="3810" b="0"/>
+            <wp:docPr id="14284286" name="Slika 2" descr="Slika na kojoj se prikazuje tekst, dijagram, snimka zaslona, Plan&#10;&#10;Opis je automatski generiran"/>
+            <wp:cNvGraphicFramePr>
+              <a:graphicFrameLocks xmlns:a="http://schemas.openxmlformats.org/drawingml/2006/main" noChangeAspect="1"/>
+            </wp:cNvGraphicFramePr>
+            <a:graphic xmlns:a="http://schemas.openxmlformats.org/drawingml/2006/main">
+              <a:graphicData uri="http://schemas.openxmlformats.org/drawingml/2006/picture">
+                <pic:pic xmlns:pic="http://schemas.openxmlformats.org/drawingml/2006/picture">
+                  <pic:nvPicPr>
+                    <pic:cNvPr id="14284286" name="Slika 2" descr="Slika na kojoj se prikazuje tekst, dijagram, snimka zaslona, Plan&#10;&#10;Opis je automatski generiran"/>
+                    <pic:cNvPicPr/>
+                  </pic:nvPicPr>
+                  <pic:blipFill>
+                    <a:blip r:embed="rId5">
+                      <a:extLst>
+                        <a:ext uri="{28A0092B-C50C-407E-A947-70E740481C1C}">
+                          <a14:useLocalDpi xmlns:a14="http://schemas.microsoft.com/office/drawing/2010/main" val="0"/>
+                        </a:ext>
+                      </a:extLst>
+                    </a:blip>
+                    <a:stretch>
+                      <a:fillRect/>
+                    </a:stretch>
+                  </pic:blipFill>
+                  <pic:spPr>
+                    <a:xfrm>
+                      <a:off x="0" y="0"/>
+                      <a:ext cx="5781222" cy="3016812"/>
+                    </a:xfrm>
+                    <a:prstGeom prst="rect">
+                      <a:avLst/>
+                    </a:prstGeom>
+                  </pic:spPr>
+                </pic:pic>
+              </a:graphicData>
+            </a:graphic>
+          </wp:inline>
+        </w:drawing>
+      </w:r>
+    </w:p>
+    <w:p>
+      <w:pPr>
+        <w:spacing w:after="0"/>
+      </w:pPr>
+    </w:p>
+    <w:p>
+      <w:pPr>
+        <w:spacing w:after="0"/>
+      </w:pPr>
+    </w:p>
+    <w:p>
+      <w:pPr>
+        <w:spacing w:after="0"/>
+        <w:rPr>
+          <w:b/>
+          <w:bCs/>
+          <w:sz w:val="24"/>
+          <w:szCs w:val="24"/>
+        </w:rPr>
+      </w:pPr>
+      <w:r>
+        <w:rPr>
+          <w:b/>
+          <w:bCs/>
+          <w:sz w:val="24"/>
+          <w:szCs w:val="24"/>
+        </w:rPr>
         <w:t xml:space="preserve">Dizajn baze podataka: </w:t>
       </w:r>
     </w:p>
@@ -1411,9 +1437,9 @@
           <w:noProof/>
         </w:rPr>
         <w:drawing>
-          <wp:inline distT="0" distB="0" distL="0" distR="0" wp14:anchorId="2559BA0A" wp14:editId="5229657D">
-            <wp:extent cx="5760720" cy="2214880"/>
-            <wp:effectExtent l="0" t="0" r="0" b="0"/>
+          <wp:inline distT="0" distB="0" distL="0" distR="0" wp14:anchorId="2559BA0A" wp14:editId="21BBF348">
+            <wp:extent cx="6183525" cy="2377440"/>
+            <wp:effectExtent l="0" t="0" r="8255" b="3810"/>
             <wp:docPr id="79220234" name="Slika 1"/>
             <wp:cNvGraphicFramePr>
               <a:graphicFrameLocks xmlns:a="http://schemas.openxmlformats.org/drawingml/2006/main" noChangeAspect="1"/>
@@ -1428,7 +1454,7 @@
                     </pic:cNvPicPr>
                   </pic:nvPicPr>
                   <pic:blipFill>
-                    <a:blip r:embed="rId4">
+                    <a:blip r:embed="rId6">
                       <a:extLst>
                         <a:ext uri="{28A0092B-C50C-407E-A947-70E740481C1C}">
                           <a14:useLocalDpi xmlns:a14="http://schemas.microsoft.com/office/drawing/2010/main" val="0"/>
@@ -1443,7 +1469,7 @@
                   <pic:spPr bwMode="auto">
                     <a:xfrm>
                       <a:off x="0" y="0"/>
-                      <a:ext cx="5760720" cy="2214880"/>
+                      <a:ext cx="6191043" cy="2380330"/>
                     </a:xfrm>
                     <a:prstGeom prst="rect">
                       <a:avLst/>
@@ -1465,23 +1491,23 @@
         <w:spacing w:after="0"/>
       </w:pPr>
       <w:r>
+        <w:t xml:space="preserve">Potrebno ju je izmijeniti. Trenutno nisam siguran za veze između tablice, no ovo su tablice koje planiram imati: </w:t>
+      </w:r>
+    </w:p>
+    <w:p>
+      <w:pPr>
+        <w:spacing w:after="0"/>
+      </w:pPr>
+    </w:p>
+    <w:p>
+      <w:pPr>
+        <w:spacing w:after="0"/>
+      </w:pPr>
+      <w:r>
+        <w:rPr>
+          <w:noProof/>
+        </w:rPr>
         <w:lastRenderedPageBreak/>
-        <w:t xml:space="preserve">Potrebno ju je izmijeniti. Trenutno nisam siguran za veze između tablice, no ovo su tablice koje planiram imati: </w:t>
-      </w:r>
-    </w:p>
-    <w:p>
-      <w:pPr>
-        <w:spacing w:after="0"/>
-      </w:pPr>
-    </w:p>
-    <w:p>
-      <w:pPr>
-        <w:spacing w:after="0"/>
-      </w:pPr>
-      <w:r>
-        <w:rPr>
-          <w:noProof/>
-        </w:rPr>
         <w:drawing>
           <wp:inline distT="0" distB="0" distL="0" distR="0" wp14:anchorId="7CE0124A" wp14:editId="310FF1C7">
             <wp:extent cx="5760720" cy="2003425"/>
@@ -1498,7 +1524,7 @@
                     <pic:cNvPicPr/>
                   </pic:nvPicPr>
                   <pic:blipFill>
-                    <a:blip r:embed="rId5">
+                    <a:blip r:embed="rId7">
                       <a:extLst>
                         <a:ext uri="{28A0092B-C50C-407E-A947-70E740481C1C}">
                           <a14:useLocalDpi xmlns:a14="http://schemas.microsoft.com/office/drawing/2010/main" val="0"/>

</xml_diff>

<commit_message>
Dorađen dokument za sastanak
</commit_message>
<xml_diff>
--- a/Dokumentacija/radna_dokumentacija.docx
+++ b/Dokumentacija/radna_dokumentacija.docx
@@ -1622,6 +1622,22 @@
       <w:pPr>
         <w:spacing w:after="0"/>
       </w:pPr>
+      <w:r>
+        <w:t>- izbacio neke ekrane te neke funkcionalnosti koje nisu potrebne</w:t>
+      </w:r>
+    </w:p>
+    <w:p>
+      <w:pPr>
+        <w:spacing w:after="0"/>
+      </w:pPr>
+      <w:r>
+        <w:t>- izbačeni i ekrani koji će se dorađivati i prilagođavati ovom projektu</w:t>
+      </w:r>
+    </w:p>
+    <w:p>
+      <w:pPr>
+        <w:spacing w:after="0"/>
+      </w:pPr>
     </w:p>
     <w:p>
       <w:pPr>
@@ -1637,6 +1653,36 @@
           <w:bCs/>
         </w:rPr>
         <w:t>- Izmijenjena stara baza podataka, sada je spremna za rad</w:t>
+      </w:r>
+    </w:p>
+    <w:p>
+      <w:pPr>
+        <w:spacing w:after="0"/>
+      </w:pPr>
+      <w:r>
+        <w:t xml:space="preserve">- napravljena pomoću </w:t>
+      </w:r>
+      <w:proofErr w:type="spellStart"/>
+      <w:r>
+        <w:t>sq</w:t>
+      </w:r>
+      <w:r>
+        <w:t>l</w:t>
+      </w:r>
+      <w:r>
+        <w:t>ite</w:t>
+      </w:r>
+      <w:proofErr w:type="spellEnd"/>
+      <w:r>
+        <w:t xml:space="preserve"> baze, u alatu DB Browser specijaliziranim za </w:t>
+      </w:r>
+      <w:proofErr w:type="spellStart"/>
+      <w:r>
+        <w:t>sqlite</w:t>
+      </w:r>
+      <w:proofErr w:type="spellEnd"/>
+      <w:r>
+        <w:t xml:space="preserve"> baze podataka.</w:t>
       </w:r>
     </w:p>
     <w:p>
@@ -1700,6 +1746,7 @@
         <w:spacing w:after="0"/>
       </w:pPr>
       <w:r>
+        <w:lastRenderedPageBreak/>
         <w:t>- postoje razlike u odnosnu na gore predviđenu bazu</w:t>
       </w:r>
     </w:p>
@@ -1726,7 +1773,6 @@
           <w:b/>
           <w:bCs/>
         </w:rPr>
-        <w:lastRenderedPageBreak/>
         <w:t>- Dodani ekrani za prijavu i registraciju korisnika u samoj aplikaciji</w:t>
       </w:r>
     </w:p>
@@ -1792,7 +1838,222 @@
     <w:p>
       <w:pPr>
         <w:spacing w:after="0"/>
-      </w:pPr>
+        <w:rPr>
+          <w:b/>
+          <w:bCs/>
+        </w:rPr>
+      </w:pPr>
+      <w:r>
+        <w:rPr>
+          <w:b/>
+          <w:bCs/>
+        </w:rPr>
+        <w:t>- Napravljena funkcionalnost prijava/registracija</w:t>
+      </w:r>
+    </w:p>
+    <w:p>
+      <w:pPr>
+        <w:spacing w:after="0"/>
+      </w:pPr>
+      <w:r>
+        <w:t>- Dodana funkcionalnost koja omogućava prijavu i registraciju korisnika</w:t>
+      </w:r>
+    </w:p>
+    <w:p>
+      <w:pPr>
+        <w:spacing w:after="0"/>
+      </w:pPr>
+      <w:r>
+        <w:t xml:space="preserve">- Korisnik se registrira samo jednom, te se mail i </w:t>
+      </w:r>
+      <w:proofErr w:type="spellStart"/>
+      <w:r>
+        <w:t>hashirana</w:t>
+      </w:r>
+      <w:proofErr w:type="spellEnd"/>
+      <w:r>
+        <w:t xml:space="preserve"> lozinka spremaju u bazu podataka</w:t>
+      </w:r>
+    </w:p>
+    <w:p>
+      <w:pPr>
+        <w:spacing w:after="0"/>
+      </w:pPr>
+      <w:r>
+        <w:t>- Korisnik se mora samo prijaviti u slučaju odjave ili ponovne instalacije aplikacije</w:t>
+      </w:r>
+    </w:p>
+    <w:p>
+      <w:pPr>
+        <w:spacing w:after="0"/>
+      </w:pPr>
+      <w:r>
+        <w:t>- Dodane i provjere za forme lozinki, odnosno maila</w:t>
+      </w:r>
+    </w:p>
+    <w:p>
+      <w:pPr>
+        <w:spacing w:after="0"/>
+      </w:pPr>
+    </w:p>
+    <w:p>
+      <w:pPr>
+        <w:spacing w:after="0"/>
+        <w:jc w:val="center"/>
+      </w:pPr>
+      <w:r>
+        <w:rPr>
+          <w:noProof/>
+        </w:rPr>
+        <w:drawing>
+          <wp:inline distT="0" distB="0" distL="0" distR="0" wp14:anchorId="54181122" wp14:editId="709029DD">
+            <wp:extent cx="3192780" cy="4130110"/>
+            <wp:effectExtent l="0" t="0" r="7620" b="3810"/>
+            <wp:docPr id="1773902005" name="Slika 1" descr="Slika na kojoj se prikazuje tekst, snimka zaslona, Font, broj&#10;&#10;Opis je automatski generiran"/>
+            <wp:cNvGraphicFramePr>
+              <a:graphicFrameLocks xmlns:a="http://schemas.openxmlformats.org/drawingml/2006/main" noChangeAspect="1"/>
+            </wp:cNvGraphicFramePr>
+            <a:graphic xmlns:a="http://schemas.openxmlformats.org/drawingml/2006/main">
+              <a:graphicData uri="http://schemas.openxmlformats.org/drawingml/2006/picture">
+                <pic:pic xmlns:pic="http://schemas.openxmlformats.org/drawingml/2006/picture">
+                  <pic:nvPicPr>
+                    <pic:cNvPr id="1773902005" name="Slika 1" descr="Slika na kojoj se prikazuje tekst, snimka zaslona, Font, broj&#10;&#10;Opis je automatski generiran"/>
+                    <pic:cNvPicPr/>
+                  </pic:nvPicPr>
+                  <pic:blipFill>
+                    <a:blip r:embed="rId10">
+                      <a:extLst>
+                        <a:ext uri="{28A0092B-C50C-407E-A947-70E740481C1C}">
+                          <a14:useLocalDpi xmlns:a14="http://schemas.microsoft.com/office/drawing/2010/main" val="0"/>
+                        </a:ext>
+                      </a:extLst>
+                    </a:blip>
+                    <a:stretch>
+                      <a:fillRect/>
+                    </a:stretch>
+                  </pic:blipFill>
+                  <pic:spPr>
+                    <a:xfrm>
+                      <a:off x="0" y="0"/>
+                      <a:ext cx="3195434" cy="4133543"/>
+                    </a:xfrm>
+                    <a:prstGeom prst="rect">
+                      <a:avLst/>
+                    </a:prstGeom>
+                  </pic:spPr>
+                </pic:pic>
+              </a:graphicData>
+            </a:graphic>
+          </wp:inline>
+        </w:drawing>
+      </w:r>
+    </w:p>
+    <w:p>
+      <w:pPr>
+        <w:spacing w:after="0"/>
+      </w:pPr>
+    </w:p>
+    <w:p>
+      <w:pPr>
+        <w:spacing w:after="0"/>
+      </w:pPr>
+    </w:p>
+    <w:p>
+      <w:pPr>
+        <w:spacing w:after="0"/>
+      </w:pPr>
+    </w:p>
+    <w:p>
+      <w:pPr>
+        <w:spacing w:after="0"/>
+      </w:pPr>
+    </w:p>
+    <w:p>
+      <w:pPr>
+        <w:spacing w:after="0"/>
+      </w:pPr>
+      <w:r>
+        <w:t>- Dodan i ekran „Profil“ na kojem pišu osnovni podatci korisnika i gdje se korisnik može odjavit</w:t>
+      </w:r>
+    </w:p>
+    <w:p>
+      <w:pPr>
+        <w:spacing w:after="0"/>
+      </w:pPr>
+      <w:r>
+        <w:t>- U bazi svaki korisnik ima svoje namirnice i ostale stvari, tako da kad se drugi korisnik prijavi u aplikaciju, prikazuju se drugi podatci</w:t>
+      </w:r>
+    </w:p>
+    <w:p>
+      <w:pPr>
+        <w:spacing w:after="0"/>
+      </w:pPr>
+    </w:p>
+    <w:p>
+      <w:pPr>
+        <w:spacing w:after="0"/>
+        <w:jc w:val="center"/>
+      </w:pPr>
+      <w:r>
+        <w:rPr>
+          <w:noProof/>
+        </w:rPr>
+        <w:drawing>
+          <wp:inline distT="0" distB="0" distL="0" distR="0" wp14:anchorId="4D58214E" wp14:editId="2F428160">
+            <wp:extent cx="2552921" cy="3787468"/>
+            <wp:effectExtent l="0" t="0" r="0" b="3810"/>
+            <wp:docPr id="1989530143" name="Slika 2" descr="Slika na kojoj se prikazuje tekst, snimka zaslona, Font, dizajn&#10;&#10;Opis je automatski generiran"/>
+            <wp:cNvGraphicFramePr>
+              <a:graphicFrameLocks xmlns:a="http://schemas.openxmlformats.org/drawingml/2006/main" noChangeAspect="1"/>
+            </wp:cNvGraphicFramePr>
+            <a:graphic xmlns:a="http://schemas.openxmlformats.org/drawingml/2006/main">
+              <a:graphicData uri="http://schemas.openxmlformats.org/drawingml/2006/picture">
+                <pic:pic xmlns:pic="http://schemas.openxmlformats.org/drawingml/2006/picture">
+                  <pic:nvPicPr>
+                    <pic:cNvPr id="1989530143" name="Slika 2" descr="Slika na kojoj se prikazuje tekst, snimka zaslona, Font, dizajn&#10;&#10;Opis je automatski generiran"/>
+                    <pic:cNvPicPr/>
+                  </pic:nvPicPr>
+                  <pic:blipFill>
+                    <a:blip r:embed="rId11">
+                      <a:extLst>
+                        <a:ext uri="{28A0092B-C50C-407E-A947-70E740481C1C}">
+                          <a14:useLocalDpi xmlns:a14="http://schemas.microsoft.com/office/drawing/2010/main" val="0"/>
+                        </a:ext>
+                      </a:extLst>
+                    </a:blip>
+                    <a:stretch>
+                      <a:fillRect/>
+                    </a:stretch>
+                  </pic:blipFill>
+                  <pic:spPr>
+                    <a:xfrm>
+                      <a:off x="0" y="0"/>
+                      <a:ext cx="2552921" cy="3787468"/>
+                    </a:xfrm>
+                    <a:prstGeom prst="rect">
+                      <a:avLst/>
+                    </a:prstGeom>
+                  </pic:spPr>
+                </pic:pic>
+              </a:graphicData>
+            </a:graphic>
+          </wp:inline>
+        </w:drawing>
+      </w:r>
+    </w:p>
+    <w:p>
+      <w:pPr>
+        <w:spacing w:after="0"/>
+        <w:jc w:val="center"/>
+      </w:pPr>
+    </w:p>
+    <w:p>
+      <w:pPr>
+        <w:spacing w:after="0"/>
+      </w:pPr>
+      <w:r>
+        <w:t>- Sljedeće na redu je početak rada sa strojnim učenjem.</w:t>
+      </w:r>
     </w:p>
     <w:p>
       <w:pPr>

</xml_diff>